<commit_message>
Final version of the documents; generated PDF files for Summons, Complaint, and Notice of Service
</commit_message>
<xml_diff>
--- a/Filings/Summons_Lu_Hu_v_Fire_Insurance_Exchange_CIV802.docx
+++ b/Filings/Summons_Lu_Hu_v_Fire_Insurance_Exchange_CIV802.docx
@@ -345,453 +345,138 @@
     <w:tbl>
       <w:tblPr>
         <w:tblW w:w="9360" w:type="dxa"/>
-        <w:tblLayout w:type="fixed"/>
-        <w:tblLook w:val="0000" w:firstRow="0" w:lastRow="0" w:firstColumn="0" w:lastColumn="0" w:noHBand="0" w:noVBand="0"/>
+        <w:tblBorders>
+          <w:top w:val="none" w:sz="0" w:space="0" w:color="FFFFFF"/>
+          <w:left w:val="none" w:sz="0" w:space="0" w:color="FFFFFF"/>
+          <w:bottom w:val="none" w:sz="0" w:space="0" w:color="FFFFFF"/>
+          <w:right w:val="none" w:sz="0" w:space="0" w:color="FFFFFF"/>
+          <w:insideH w:val="none" w:sz="0" w:space="0" w:color="FFFFFF"/>
+          <w:insideV w:val="none" w:sz="0" w:space="0" w:color="FFFFFF"/>
+        </w:tblBorders>
+        <w:tblCellMar>
+          <w:left w:w="10" w:type="dxa"/>
+          <w:right w:w="10" w:type="dxa"/>
+        </w:tblCellMar>
+        <w:tblLook w:val="04A0" w:firstRow="1" w:lastRow="0" w:firstColumn="1" w:lastColumn="0" w:noHBand="0" w:noVBand="1"/>
       </w:tblPr>
       <w:tblGrid>
-        <w:gridCol w:w="4320"/>
-        <w:gridCol w:w="720"/>
-        <w:gridCol w:w="4050"/>
-        <w:gridCol w:w="270"/>
+        <w:gridCol w:w="4680"/>
+        <w:gridCol w:w="4680"/>
       </w:tblGrid>
       <w:tr>
         <w:tc>
           <w:tcPr>
-            <w:tcW w:w="4320" w:type="dxa"/>
+            <w:tcW w:w="4680" w:type="dxa"/>
             <w:tcBorders>
-              <w:bottom w:val="single" w:sz="4" w:space="0" w:color="000000"/>
+              <w:right w:val="single" w:sz="6" w:space="0" w:color="000000"/>
             </w:tcBorders>
+            <w:tcMar>
+              <w:top w:w="80" w:type="dxa"/>
+              <w:left w:w="0" w:type="dxa"/>
+              <w:bottom w:w="80" w:type="dxa"/>
+              <w:right w:w="160" w:type="dxa"/>
+            </w:tcMar>
           </w:tcPr>
           <w:p>
+            <w:proofErr w:type="spellStart"/>
+            <w:r>
+              <w:t>Yibiao</w:t>
+            </w:r>
+            <w:proofErr w:type="spellEnd"/>
+            <w:r>
+              <w:t xml:space="preserve"> Lu and Jie Hu,</w:t>
+            </w:r>
+          </w:p>
+          <w:p/>
+          <w:p>
             <w:pPr>
-              <w:snapToGrid w:val="0"/>
+              <w:ind w:left="1440"/>
             </w:pPr>
             <w:r>
-              <w:t>Yibiao Lu and Jie Hu</w:t>
+              <w:t>Plaintiffs,</w:t>
+            </w:r>
+          </w:p>
+          <w:p/>
+          <w:p>
+            <w:r>
+              <w:t>v.</w:t>
+            </w:r>
+          </w:p>
+          <w:p/>
+          <w:p>
+            <w:r>
+              <w:t>Fire Insurance Exchange, by and through</w:t>
+            </w:r>
+          </w:p>
+          <w:p>
+            <w:r>
+              <w:t>its attorney-in-fact, Fire Underwriters</w:t>
+            </w:r>
+          </w:p>
+          <w:p>
+            <w:r>
+              <w:t>Association (d/b/a Farmers Insurance),</w:t>
+            </w:r>
+          </w:p>
+          <w:p/>
+          <w:p>
+            <w:pPr>
+              <w:ind w:left="1440"/>
+            </w:pPr>
+            <w:r>
+              <w:t>Defendant.</w:t>
             </w:r>
           </w:p>
         </w:tc>
         <w:tc>
           <w:tcPr>
-            <w:tcW w:w="720" w:type="dxa"/>
+            <w:tcW w:w="4680" w:type="dxa"/>
+            <w:tcMar>
+              <w:top w:w="80" w:type="dxa"/>
+              <w:left w:w="160" w:type="dxa"/>
+              <w:bottom w:w="80" w:type="dxa"/>
+              <w:right w:w="0" w:type="dxa"/>
+            </w:tcMar>
           </w:tcPr>
+          <w:p/>
+          <w:p/>
+          <w:p/>
           <w:p>
             <w:pPr>
-              <w:snapToGrid w:val="0"/>
-            </w:pPr>
-          </w:p>
-        </w:tc>
-        <w:tc>
-          <w:tcPr>
-            <w:tcW w:w="4050" w:type="dxa"/>
-            <w:vMerge w:val="restart"/>
-            <w:tcBorders>
-              <w:bottom w:val="single" w:sz="4" w:space="0" w:color="000000"/>
-            </w:tcBorders>
-            <w:vAlign w:val="center"/>
-          </w:tcPr>
-          <w:p>
-            <w:pPr>
-              <w:pStyle w:val="Heading1"/>
               <w:rPr>
-                <w:sz w:val="28"/>
+                <w:b/>
+                <w:bCs/>
               </w:rPr>
             </w:pPr>
             <w:r>
               <w:rPr>
+                <w:b/>
+                <w:bCs/>
+                <w:sz w:val="28"/>
+              </w:rPr>
+              <w:t xml:space="preserve">                 </w:t>
+            </w:r>
+            <w:r>
+              <w:rPr>
+                <w:b/>
+                <w:bCs/>
                 <w:sz w:val="28"/>
               </w:rPr>
               <w:t>Civil Summons</w:t>
             </w:r>
           </w:p>
         </w:tc>
-        <w:tc>
-          <w:tcPr>
-            <w:tcW w:w="270" w:type="dxa"/>
-          </w:tcPr>
-          <w:p>
-            <w:pPr>
-              <w:snapToGrid w:val="0"/>
-              <w:rPr>
-                <w:sz w:val="28"/>
-              </w:rPr>
-            </w:pPr>
-          </w:p>
-        </w:tc>
-      </w:tr>
-      <w:tr>
-        <w:tc>
-          <w:tcPr>
-            <w:tcW w:w="4320" w:type="dxa"/>
-            <w:tcBorders>
-              <w:top w:val="single" w:sz="4" w:space="0" w:color="000000"/>
-            </w:tcBorders>
-          </w:tcPr>
-          <w:p>
-            <w:pPr>
-              <w:rPr>
-                <w:sz w:val="20"/>
-              </w:rPr>
-            </w:pPr>
-            <w:r>
-              <w:rPr>
-                <w:sz w:val="22"/>
-              </w:rPr>
-              <w:t>Plaintiff</w:t>
-            </w:r>
-          </w:p>
-        </w:tc>
-        <w:tc>
-          <w:tcPr>
-            <w:tcW w:w="720" w:type="dxa"/>
-          </w:tcPr>
-          <w:p>
-            <w:pPr>
-              <w:snapToGrid w:val="0"/>
-              <w:rPr>
-                <w:sz w:val="20"/>
-              </w:rPr>
-            </w:pPr>
-          </w:p>
-        </w:tc>
-        <w:tc>
-          <w:tcPr>
-            <w:tcW w:w="4050" w:type="dxa"/>
-            <w:vMerge/>
-            <w:tcBorders>
-              <w:bottom w:val="single" w:sz="4" w:space="0" w:color="000000"/>
-            </w:tcBorders>
-            <w:vAlign w:val="center"/>
-          </w:tcPr>
-          <w:p>
-            <w:pPr>
-              <w:snapToGrid w:val="0"/>
-            </w:pPr>
-          </w:p>
-        </w:tc>
-        <w:tc>
-          <w:tcPr>
-            <w:tcW w:w="270" w:type="dxa"/>
-          </w:tcPr>
-          <w:p>
-            <w:pPr>
-              <w:snapToGrid w:val="0"/>
-            </w:pPr>
-          </w:p>
-        </w:tc>
-      </w:tr>
-      <w:tr>
-        <w:tc>
-          <w:tcPr>
-            <w:tcW w:w="4320" w:type="dxa"/>
-          </w:tcPr>
-          <w:p>
-            <w:pPr>
-              <w:snapToGrid w:val="0"/>
-            </w:pPr>
-          </w:p>
-        </w:tc>
-        <w:tc>
-          <w:tcPr>
-            <w:tcW w:w="720" w:type="dxa"/>
-          </w:tcPr>
-          <w:p>
-            <w:pPr>
-              <w:snapToGrid w:val="0"/>
-            </w:pPr>
-          </w:p>
-        </w:tc>
-        <w:tc>
-          <w:tcPr>
-            <w:tcW w:w="4050" w:type="dxa"/>
-            <w:vMerge/>
-            <w:tcBorders>
-              <w:bottom w:val="single" w:sz="4" w:space="0" w:color="000000"/>
-            </w:tcBorders>
-            <w:vAlign w:val="center"/>
-          </w:tcPr>
-          <w:p>
-            <w:pPr>
-              <w:snapToGrid w:val="0"/>
-            </w:pPr>
-          </w:p>
-        </w:tc>
-        <w:tc>
-          <w:tcPr>
-            <w:tcW w:w="270" w:type="dxa"/>
-          </w:tcPr>
-          <w:p>
-            <w:pPr>
-              <w:snapToGrid w:val="0"/>
-            </w:pPr>
-          </w:p>
-        </w:tc>
-      </w:tr>
-      <w:tr>
-        <w:tc>
-          <w:tcPr>
-            <w:tcW w:w="4320" w:type="dxa"/>
-          </w:tcPr>
-          <w:p>
-            <w:pPr>
-              <w:rPr>
-                <w:sz w:val="22"/>
-              </w:rPr>
-            </w:pPr>
-            <w:r>
-              <w:rPr>
-                <w:sz w:val="22"/>
-              </w:rPr>
-              <w:t>vs</w:t>
-            </w:r>
-          </w:p>
-        </w:tc>
-        <w:tc>
-          <w:tcPr>
-            <w:tcW w:w="720" w:type="dxa"/>
-          </w:tcPr>
-          <w:p>
-            <w:pPr>
-              <w:snapToGrid w:val="0"/>
-              <w:rPr>
-                <w:sz w:val="22"/>
-              </w:rPr>
-            </w:pPr>
-          </w:p>
-        </w:tc>
-        <w:tc>
-          <w:tcPr>
-            <w:tcW w:w="4050" w:type="dxa"/>
-            <w:vMerge/>
-            <w:tcBorders>
-              <w:bottom w:val="single" w:sz="4" w:space="0" w:color="000000"/>
-            </w:tcBorders>
-            <w:vAlign w:val="center"/>
-          </w:tcPr>
-          <w:p>
-            <w:pPr>
-              <w:snapToGrid w:val="0"/>
-            </w:pPr>
-          </w:p>
-        </w:tc>
-        <w:tc>
-          <w:tcPr>
-            <w:tcW w:w="270" w:type="dxa"/>
-          </w:tcPr>
-          <w:p>
-            <w:pPr>
-              <w:snapToGrid w:val="0"/>
-            </w:pPr>
-          </w:p>
-        </w:tc>
-      </w:tr>
-      <w:tr>
-        <w:tc>
-          <w:tcPr>
-            <w:tcW w:w="4320" w:type="dxa"/>
-          </w:tcPr>
-          <w:p>
-            <w:pPr>
-              <w:snapToGrid w:val="0"/>
-            </w:pPr>
-            <w:r>
-              <w:t>Fire Insurance Exchange, by and through its attorney-in-fact, Fire Underwriters Association (d/b/a Farmers Insurance)</w:t>
-            </w:r>
-          </w:p>
-        </w:tc>
-        <w:tc>
-          <w:tcPr>
-            <w:tcW w:w="720" w:type="dxa"/>
-          </w:tcPr>
-          <w:p>
-            <w:pPr>
-              <w:snapToGrid w:val="0"/>
-            </w:pPr>
-          </w:p>
-        </w:tc>
-        <w:tc>
-          <w:tcPr>
-            <w:tcW w:w="4050" w:type="dxa"/>
-            <w:vMerge/>
-            <w:tcBorders>
-              <w:bottom w:val="single" w:sz="4" w:space="0" w:color="000000"/>
-            </w:tcBorders>
-            <w:vAlign w:val="center"/>
-          </w:tcPr>
-          <w:p>
-            <w:pPr>
-              <w:snapToGrid w:val="0"/>
-            </w:pPr>
-          </w:p>
-        </w:tc>
-        <w:tc>
-          <w:tcPr>
-            <w:tcW w:w="270" w:type="dxa"/>
-          </w:tcPr>
-          <w:p>
-            <w:pPr>
-              <w:snapToGrid w:val="0"/>
-            </w:pPr>
-          </w:p>
-        </w:tc>
-      </w:tr>
-      <w:tr>
-        <w:tc>
-          <w:tcPr>
-            <w:tcW w:w="4320" w:type="dxa"/>
-            <w:tcBorders>
-              <w:bottom w:val="single" w:sz="4" w:space="0" w:color="000000"/>
-            </w:tcBorders>
-          </w:tcPr>
-          <w:p>
-            <w:pPr>
-              <w:snapToGrid w:val="0"/>
-            </w:pPr>
-          </w:p>
-        </w:tc>
-        <w:tc>
-          <w:tcPr>
-            <w:tcW w:w="720" w:type="dxa"/>
-          </w:tcPr>
-          <w:p>
-            <w:pPr>
-              <w:snapToGrid w:val="0"/>
-            </w:pPr>
-          </w:p>
-        </w:tc>
-        <w:tc>
-          <w:tcPr>
-            <w:tcW w:w="4050" w:type="dxa"/>
-            <w:vMerge/>
-            <w:tcBorders>
-              <w:bottom w:val="single" w:sz="4" w:space="0" w:color="000000"/>
-            </w:tcBorders>
-            <w:vAlign w:val="center"/>
-          </w:tcPr>
-          <w:p>
-            <w:pPr>
-              <w:snapToGrid w:val="0"/>
-            </w:pPr>
-          </w:p>
-        </w:tc>
-        <w:tc>
-          <w:tcPr>
-            <w:tcW w:w="270" w:type="dxa"/>
-          </w:tcPr>
-          <w:p>
-            <w:pPr>
-              <w:snapToGrid w:val="0"/>
-            </w:pPr>
-          </w:p>
-        </w:tc>
-      </w:tr>
-      <w:tr>
-        <w:tc>
-          <w:tcPr>
-            <w:tcW w:w="4320" w:type="dxa"/>
-            <w:tcBorders>
-              <w:top w:val="single" w:sz="4" w:space="0" w:color="000000"/>
-            </w:tcBorders>
-          </w:tcPr>
-          <w:p>
-            <w:pPr>
-              <w:rPr>
-                <w:sz w:val="22"/>
-              </w:rPr>
-            </w:pPr>
-            <w:r>
-              <w:rPr>
-                <w:sz w:val="22"/>
-              </w:rPr>
-              <w:t>Defendant</w:t>
-            </w:r>
-          </w:p>
-        </w:tc>
-        <w:tc>
-          <w:tcPr>
-            <w:tcW w:w="720" w:type="dxa"/>
-          </w:tcPr>
-          <w:p>
-            <w:pPr>
-              <w:snapToGrid w:val="0"/>
-            </w:pPr>
-          </w:p>
-        </w:tc>
-        <w:tc>
-          <w:tcPr>
-            <w:tcW w:w="4050" w:type="dxa"/>
-            <w:vMerge/>
-            <w:tcBorders>
-              <w:bottom w:val="single" w:sz="4" w:space="0" w:color="000000"/>
-            </w:tcBorders>
-            <w:vAlign w:val="center"/>
-          </w:tcPr>
-          <w:p>
-            <w:pPr>
-              <w:snapToGrid w:val="0"/>
-            </w:pPr>
-          </w:p>
-        </w:tc>
-        <w:tc>
-          <w:tcPr>
-            <w:tcW w:w="270" w:type="dxa"/>
-          </w:tcPr>
-          <w:p>
-            <w:pPr>
-              <w:snapToGrid w:val="0"/>
-            </w:pPr>
-          </w:p>
-        </w:tc>
       </w:tr>
     </w:tbl>
     <w:p>
       <w:pPr>
-        <w:rPr>
-          <w:szCs w:val="24"/>
-          <w:u w:val="single"/>
-        </w:rPr>
-      </w:pPr>
-    </w:p>
-    <w:p>
-      <w:r>
-        <w:rPr>
-          <w:noProof/>
-        </w:rPr>
-      </w:r>
-      <w:r>
-        <w:pict w14:anchorId="2D7ADD49">
-          <v:rect id="Rectangle 1" o:spid="_x0000_s1026" style="width:468pt;height:1.5pt;visibility:visible;mso-wrap-style:square;mso-left-percent:-10001;mso-top-percent:-10001;mso-position-horizontal:absolute;mso-position-horizontal-relative:char;mso-position-vertical:absolute;mso-position-vertical-relative:line;mso-left-percent:-10001;mso-top-percent:-10001;v-text-anchor:top" o:gfxdata="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" fillcolor="#a0a0a0" stroked="f" strokeweight="0">
-            <w10:anchorlock/>
-          </v:rect>
-        </w:pict>
-      </w:r>
-    </w:p>
-    <w:p>
-      <w:r>
-        <w:tab/>
-      </w:r>
-      <w:r>
-        <w:tab/>
-      </w:r>
-      <w:r>
-        <w:tab/>
-      </w:r>
-      <w:r>
-        <w:tab/>
-      </w:r>
-      <w:r>
-        <w:tab/>
-      </w:r>
-      <w:r>
-        <w:tab/>
-      </w:r>
-      <w:r>
-        <w:tab/>
-      </w:r>
-      <w:r>
-        <w:tab/>
-      </w:r>
-    </w:p>
+        <w:pBdr>
+          <w:bottom w:val="single" w:sz="6" w:space="1" w:color="000000"/>
+        </w:pBdr>
+        <w:spacing w:before="60" w:after="60"/>
+      </w:pPr>
+    </w:p>
+    <w:p/>
     <w:p>
       <w:r>
         <w:t xml:space="preserve">This Summons is directed to (name of Defendant): </w:t>
@@ -896,7 +581,13 @@
         <w:t>service</w:t>
       </w:r>
       <w:r>
-        <w:t xml:space="preserve">.You must serve a copy of your </w:t>
+        <w:t>.</w:t>
+      </w:r>
+      <w:r>
+        <w:t xml:space="preserve"> </w:t>
+      </w:r>
+      <w:r>
+        <w:t xml:space="preserve">You must serve a copy of your </w:t>
       </w:r>
       <w:r>
         <w:rPr>
@@ -975,9 +666,6 @@
       <w:r>
         <w:br/>
       </w:r>
-      <w:r>
-        <w:br/>
-      </w:r>
     </w:p>
     <w:p>
       <w:pPr>
@@ -1134,7 +822,6 @@
         <w:spacing w:after="160" w:line="257" w:lineRule="auto"/>
       </w:pPr>
       <w:r>
-        <w:lastRenderedPageBreak/>
         <w:t>4.</w:t>
       </w:r>
       <w:r>
@@ -1195,7 +882,27 @@
           <w:szCs w:val="25"/>
           <w:shd w:val="clear" w:color="auto" w:fill="FFFFFF"/>
         </w:rPr>
-        <w:t xml:space="preserve">, you don’t need to respond. A default judgment can than be entered against you for what the Plaintiff asked for in the </w:t>
+        <w:t xml:space="preserve">, you don’t need to respond. A default judgment can </w:t>
+      </w:r>
+      <w:proofErr w:type="spellStart"/>
+      <w:r>
+        <w:rPr>
+          <w:color w:val="000000"/>
+          <w:sz w:val="25"/>
+          <w:szCs w:val="25"/>
+          <w:shd w:val="clear" w:color="auto" w:fill="FFFFFF"/>
+        </w:rPr>
+        <w:t>than</w:t>
+      </w:r>
+      <w:proofErr w:type="spellEnd"/>
+      <w:r>
+        <w:rPr>
+          <w:color w:val="000000"/>
+          <w:sz w:val="25"/>
+          <w:szCs w:val="25"/>
+          <w:shd w:val="clear" w:color="auto" w:fill="FFFFFF"/>
+        </w:rPr>
+        <w:t xml:space="preserve"> be entered against you for what the Plaintiff asked for in the </w:t>
       </w:r>
       <w:r>
         <w:rPr>
@@ -1248,8 +955,13 @@
       <w:pPr>
         <w:ind w:left="720"/>
       </w:pPr>
-      <w:r>
-        <w:t xml:space="preserve">Yibiao Lu and Jie Hu, </w:t>
+      <w:proofErr w:type="spellStart"/>
+      <w:r>
+        <w:t>Yibiao</w:t>
+      </w:r>
+      <w:proofErr w:type="spellEnd"/>
+      <w:r>
+        <w:t xml:space="preserve"> Lu and Jie Hu, </w:t>
       </w:r>
     </w:p>
     <w:p>
@@ -1402,7 +1114,23 @@
           <w:b/>
           <w:bCs/>
         </w:rPr>
-        <w:t>to protect your rights or you may lose the case.</w:t>
+        <w:t xml:space="preserve">to protect your </w:t>
+      </w:r>
+      <w:proofErr w:type="gramStart"/>
+      <w:r>
+        <w:rPr>
+          <w:b/>
+          <w:bCs/>
+        </w:rPr>
+        <w:t>rights</w:t>
+      </w:r>
+      <w:proofErr w:type="gramEnd"/>
+      <w:r>
+        <w:rPr>
+          <w:b/>
+          <w:bCs/>
+        </w:rPr>
+        <w:t xml:space="preserve"> or you may lose the case.</w:t>
       </w:r>
     </w:p>
     <w:p>
@@ -1451,108 +1179,94 @@
           <w:tab w:val="clear" w:pos="8640"/>
         </w:tabs>
         <w:rPr>
-          <w:sz w:val="18"/>
-          <w:szCs w:val="18"/>
-        </w:rPr>
-      </w:pPr>
-      <w:r>
-        <w:rPr>
-          <w:sz w:val="18"/>
-          <w:szCs w:val="18"/>
+          <w:szCs w:val="24"/>
+        </w:rPr>
+      </w:pPr>
+      <w:r>
+        <w:rPr>
+          <w:szCs w:val="24"/>
           <w:u w:val="single"/>
         </w:rPr>
-        <w:tab/>
-      </w:r>
-      <w:r>
-        <w:rPr>
-          <w:sz w:val="18"/>
-          <w:szCs w:val="18"/>
+        <w:t>June 30, 2026</w:t>
+      </w:r>
+      <w:r>
+        <w:rPr>
+          <w:szCs w:val="24"/>
           <w:u w:val="single"/>
         </w:rPr>
         <w:tab/>
       </w:r>
       <w:r>
         <w:rPr>
-          <w:sz w:val="18"/>
-          <w:szCs w:val="18"/>
+          <w:szCs w:val="24"/>
           <w:u w:val="single"/>
         </w:rPr>
         <w:tab/>
       </w:r>
       <w:r>
         <w:rPr>
-          <w:sz w:val="18"/>
-          <w:szCs w:val="18"/>
+          <w:szCs w:val="24"/>
           <w:u w:val="single"/>
         </w:rPr>
         <w:tab/>
       </w:r>
       <w:r>
         <w:rPr>
-          <w:sz w:val="18"/>
-          <w:szCs w:val="18"/>
-        </w:rPr>
-        <w:tab/>
-      </w:r>
-      <w:r>
-        <w:rPr>
-          <w:sz w:val="18"/>
-          <w:szCs w:val="18"/>
-        </w:rPr>
-        <w:tab/>
-      </w:r>
-      <w:r>
-        <w:rPr>
-          <w:sz w:val="18"/>
-          <w:szCs w:val="18"/>
+          <w:szCs w:val="24"/>
+        </w:rPr>
+        <w:tab/>
+      </w:r>
+      <w:r>
+        <w:rPr>
+          <w:szCs w:val="24"/>
+        </w:rPr>
+        <w:t xml:space="preserve">       </w:t>
+      </w:r>
+      <w:r>
+        <w:rPr>
+          <w:szCs w:val="24"/>
           <w:u w:val="single"/>
         </w:rPr>
         <w:tab/>
       </w:r>
       <w:r>
         <w:rPr>
-          <w:sz w:val="18"/>
-          <w:szCs w:val="18"/>
+          <w:szCs w:val="24"/>
           <w:u w:val="single"/>
         </w:rPr>
         <w:tab/>
       </w:r>
       <w:r>
         <w:rPr>
-          <w:sz w:val="18"/>
-          <w:szCs w:val="18"/>
+          <w:szCs w:val="24"/>
           <w:u w:val="single"/>
         </w:rPr>
         <w:tab/>
       </w:r>
       <w:r>
         <w:rPr>
-          <w:sz w:val="18"/>
-          <w:szCs w:val="18"/>
+          <w:szCs w:val="24"/>
           <w:u w:val="single"/>
         </w:rPr>
         <w:tab/>
       </w:r>
       <w:r>
         <w:rPr>
-          <w:sz w:val="18"/>
-          <w:szCs w:val="18"/>
+          <w:szCs w:val="24"/>
           <w:u w:val="single"/>
         </w:rPr>
         <w:tab/>
       </w:r>
       <w:r>
         <w:rPr>
-          <w:sz w:val="18"/>
-          <w:szCs w:val="18"/>
+          <w:szCs w:val="24"/>
           <w:u w:val="single"/>
         </w:rPr>
         <w:tab/>
       </w:r>
       <w:r>
         <w:rPr>
-          <w:sz w:val="18"/>
-          <w:szCs w:val="18"/>
+          <w:szCs w:val="24"/>
           <w:u w:val="single"/>
         </w:rPr>
         <w:tab/>
@@ -1570,7 +1284,7 @@
         <w:t xml:space="preserve">Date                         </w:t>
       </w:r>
       <w:r>
-        <w:t xml:space="preserve">                                       </w:t>
+        <w:t xml:space="preserve">                                  </w:t>
       </w:r>
       <w:r>
         <w:t>Signature</w:t>
@@ -1641,20 +1355,27 @@
           <w:sz w:val="18"/>
           <w:szCs w:val="18"/>
         </w:rPr>
-        <w:tab/>
-      </w:r>
-      <w:r>
-        <w:rPr>
-          <w:sz w:val="18"/>
-          <w:szCs w:val="18"/>
-        </w:rPr>
-        <w:tab/>
+        <w:t xml:space="preserve">                         </w:t>
       </w:r>
       <w:r>
         <w:rPr>
           <w:szCs w:val="24"/>
         </w:rPr>
-        <w:t>Name: Yibiao Lu and Jie Hu, Plaintiffs Pro Se</w:t>
+        <w:t xml:space="preserve">Name: </w:t>
+      </w:r>
+      <w:proofErr w:type="spellStart"/>
+      <w:r>
+        <w:rPr>
+          <w:szCs w:val="24"/>
+        </w:rPr>
+        <w:t>Yibiao</w:t>
+      </w:r>
+      <w:proofErr w:type="spellEnd"/>
+      <w:r>
+        <w:rPr>
+          <w:szCs w:val="24"/>
+        </w:rPr>
+        <w:t xml:space="preserve"> Lu and Jie Hu, Plaintiffs Pro Se</w:t>
       </w:r>
     </w:p>
     <w:p>
@@ -1677,7 +1398,9 @@
         <w:tab/>
       </w:r>
       <w:r>
-        <w:tab/>
+        <w:t xml:space="preserve">       </w:t>
+      </w:r>
+      <w:r>
         <w:t>Address: 17756 George Moran Dr.</w:t>
       </w:r>
     </w:p>
@@ -1701,8 +1424,13 @@
         <w:tab/>
       </w:r>
       <w:r>
-        <w:tab/>
-        <w:t>City, State, Zip: Eden Prairie, MN 55347</w:t>
+        <w:t xml:space="preserve">       </w:t>
+      </w:r>
+      <w:r>
+        <w:t xml:space="preserve">                </w:t>
+      </w:r>
+      <w:r>
+        <w:t>Eden Prairie, MN 55347</w:t>
       </w:r>
     </w:p>
     <w:p>
@@ -1725,8 +1453,16 @@
         <w:tab/>
       </w:r>
       <w:r>
-        <w:tab/>
-        <w:t>Telephone: ____________________</w:t>
+        <w:t xml:space="preserve">       </w:t>
+      </w:r>
+      <w:r>
+        <w:t xml:space="preserve">Telephone: </w:t>
+      </w:r>
+      <w:r>
+        <w:t>763-843-2859</w:t>
+      </w:r>
+      <w:r>
+        <w:t>, 763-843-2860</w:t>
       </w:r>
     </w:p>
     <w:p>
@@ -1749,12 +1485,24 @@
         <w:tab/>
       </w:r>
       <w:r>
-        <w:tab/>
-        <w:t>E-mail: ____________________</w:t>
+        <w:t xml:space="preserve">       </w:t>
+      </w:r>
+      <w:r>
+        <w:t>E-mail:</w:t>
+      </w:r>
+      <w:r>
+        <w:t xml:space="preserve"> </w:t>
+      </w:r>
+      <w:r>
+        <w:t>bill_y_lu@yahoo.com</w:t>
+      </w:r>
+      <w:r>
+        <w:t>, jie_h_hu@yahoo.com</w:t>
       </w:r>
     </w:p>
     <w:sectPr>
-      <w:footerReference w:type="default" r:id="rId9"/>
+      <w:footerReference w:type="even" r:id="rId9"/>
+      <w:footerReference w:type="default" r:id="rId10"/>
       <w:pgSz w:w="12240" w:h="15840"/>
       <w:pgMar w:top="1440" w:right="1440" w:bottom="1440" w:left="1440" w:header="0" w:footer="432" w:gutter="0"/>
       <w:pgNumType w:start="1"/>
@@ -1790,15 +1538,84 @@
   <w:p>
     <w:pPr>
       <w:pStyle w:val="Footer"/>
+      <w:framePr w:wrap="none" w:vAnchor="text" w:hAnchor="margin" w:xAlign="center" w:y="1"/>
+      <w:rPr>
+        <w:rStyle w:val="PageNumber"/>
+      </w:rPr>
     </w:pPr>
     <w:r>
       <w:rPr>
-        <w:rFonts w:ascii="Arial" w:hAnsi="Arial" w:cs="Arial"/>
-        <w:i/>
-        <w:sz w:val="18"/>
-        <w:szCs w:val="18"/>
+        <w:rStyle w:val="PageNumber"/>
       </w:rPr>
-      <w:t>Civil Summons</w:t>
+      <w:fldChar w:fldCharType="begin"/>
+    </w:r>
+    <w:r>
+      <w:rPr>
+        <w:rStyle w:val="PageNumber"/>
+      </w:rPr>
+      <w:instrText xml:space="preserve"> PAGE </w:instrText>
+    </w:r>
+    <w:r>
+      <w:rPr>
+        <w:rStyle w:val="PageNumber"/>
+      </w:rPr>
+      <w:fldChar w:fldCharType="separate"/>
+    </w:r>
+    <w:r>
+      <w:rPr>
+        <w:rStyle w:val="PageNumber"/>
+      </w:rPr>
+      <w:fldChar w:fldCharType="end"/>
+    </w:r>
+  </w:p>
+  <w:p>
+    <w:pPr>
+      <w:pStyle w:val="Footer"/>
+    </w:pPr>
+  </w:p>
+</w:ftr>
+</file>
+
+<file path=word/footer2.xml><?xml version="1.0" encoding="utf-8"?>
+<w:ftr xmlns:wpc="http://schemas.microsoft.com/office/word/2010/wordprocessingCanvas" xmlns:cx="http://schemas.microsoft.com/office/drawing/2014/chartex" xmlns:cx1="http://schemas.microsoft.com/office/drawing/2015/9/8/chartex" xmlns:cx2="http://schemas.microsoft.com/office/drawing/2015/10/21/chartex" xmlns:cx3="http://schemas.microsoft.com/office/drawing/2016/5/9/chartex" xmlns:cx4="http://schemas.microsoft.com/office/drawing/2016/5/10/chartex" xmlns:cx5="http://schemas.microsoft.com/office/drawing/2016/5/11/chartex" xmlns:cx6="http://schemas.microsoft.com/office/drawing/2016/5/12/chartex" xmlns:cx7="http://schemas.microsoft.com/office/drawing/2016/5/13/chartex" xmlns:cx8="http://schemas.microsoft.com/office/drawing/2016/5/14/chartex" xmlns:mc="http://schemas.openxmlformats.org/markup-compatibility/2006" xmlns:aink="http://schemas.microsoft.com/office/drawing/2016/ink" xmlns:am3d="http://schemas.microsoft.com/office/drawing/2017/model3d" xmlns:o="urn:schemas-microsoft-com:office:office" xmlns:oel="http://schemas.microsoft.com/office/2019/extlst" xmlns:r="http://schemas.openxmlformats.org/officeDocument/2006/relationships" xmlns:m="http://schemas.openxmlformats.org/officeDocument/2006/math" xmlns:v="urn:schemas-microsoft-com:vml" xmlns:wp14="http://schemas.microsoft.com/office/word/2010/wordprocessingDrawing" xmlns:wp="http://schemas.openxmlformats.org/drawingml/2006/wordprocessingDrawing" xmlns:w10="urn:schemas-microsoft-com:office:word" xmlns:w="http://schemas.openxmlformats.org/wordprocessingml/2006/main" xmlns:w14="http://schemas.microsoft.com/office/word/2010/wordml" xmlns:w15="http://schemas.microsoft.com/office/word/2012/wordml" xmlns:w16cex="http://schemas.microsoft.com/office/word/2018/wordml/cex" xmlns:w16cid="http://schemas.microsoft.com/office/word/2016/wordml/cid" xmlns:w16="http://schemas.microsoft.com/office/word/2018/wordml" xmlns:w16du="http://schemas.microsoft.com/office/word/2023/wordml/word16du" xmlns:w16sdtdh="http://schemas.microsoft.com/office/word/2020/wordml/sdtdatahash" xmlns:w16sdtfl="http://schemas.microsoft.com/office/word/2024/wordml/sdtformatlock" xmlns:w16se="http://schemas.microsoft.com/office/word/2015/wordml/symex" xmlns:wpg="http://schemas.microsoft.com/office/word/2010/wordprocessingGroup" xmlns:wpi="http://schemas.microsoft.com/office/word/2010/wordprocessingInk" xmlns:wne="http://schemas.microsoft.com/office/word/2006/wordml" xmlns:wps="http://schemas.microsoft.com/office/word/2010/wordprocessingShape" mc:Ignorable="w14 w15 w16se w16cid w16 w16cex w16sdtdh w16sdtfl w16du wp14">
+  <w:p>
+    <w:pPr>
+      <w:pStyle w:val="Footer"/>
+      <w:framePr w:wrap="none" w:vAnchor="text" w:hAnchor="margin" w:xAlign="center" w:y="1"/>
+      <w:rPr>
+        <w:rStyle w:val="PageNumber"/>
+      </w:rPr>
+    </w:pPr>
+    <w:r>
+      <w:rPr>
+        <w:rStyle w:val="PageNumber"/>
+      </w:rPr>
+      <w:fldChar w:fldCharType="begin"/>
+    </w:r>
+    <w:r>
+      <w:rPr>
+        <w:rStyle w:val="PageNumber"/>
+      </w:rPr>
+      <w:instrText xml:space="preserve"> PAGE </w:instrText>
+    </w:r>
+    <w:r>
+      <w:rPr>
+        <w:rStyle w:val="PageNumber"/>
+      </w:rPr>
+      <w:fldChar w:fldCharType="separate"/>
+    </w:r>
+    <w:r>
+      <w:rPr>
+        <w:rStyle w:val="PageNumber"/>
+        <w:noProof/>
+      </w:rPr>
+      <w:t>1</w:t>
+    </w:r>
+    <w:r>
+      <w:rPr>
+        <w:rStyle w:val="PageNumber"/>
+      </w:rPr>
+      <w:fldChar w:fldCharType="end"/>
     </w:r>
   </w:p>
   <w:p>
@@ -1811,7 +1628,7 @@
         <w:sz w:val="18"/>
         <w:szCs w:val="18"/>
       </w:rPr>
-      <w:t xml:space="preserve">CIV802           State           ENG           11/20 </w:t>
+      <w:t xml:space="preserve"> </w:t>
     </w:r>
     <w:r>
       <w:rPr>
@@ -1820,113 +1637,6 @@
         <w:szCs w:val="18"/>
       </w:rPr>
       <w:tab/>
-    </w:r>
-    <w:r>
-      <w:rPr>
-        <w:rFonts w:ascii="Arial" w:hAnsi="Arial" w:cs="Arial"/>
-        <w:sz w:val="18"/>
-        <w:szCs w:val="18"/>
-      </w:rPr>
-      <w:tab/>
-      <w:t xml:space="preserve">www.mncourts.gov/forms                  Page </w:t>
-    </w:r>
-    <w:r>
-      <w:rPr>
-        <w:rFonts w:ascii="Arial" w:hAnsi="Arial" w:cs="Arial"/>
-        <w:bCs/>
-        <w:sz w:val="18"/>
-        <w:szCs w:val="18"/>
-      </w:rPr>
-      <w:fldChar w:fldCharType="begin"/>
-    </w:r>
-    <w:r>
-      <w:rPr>
-        <w:rFonts w:ascii="Arial" w:hAnsi="Arial" w:cs="Arial"/>
-        <w:bCs/>
-        <w:sz w:val="18"/>
-        <w:szCs w:val="18"/>
-      </w:rPr>
-      <w:instrText xml:space="preserve"> PAGE </w:instrText>
-    </w:r>
-    <w:r>
-      <w:rPr>
-        <w:rFonts w:ascii="Arial" w:hAnsi="Arial" w:cs="Arial"/>
-        <w:bCs/>
-        <w:sz w:val="18"/>
-        <w:szCs w:val="18"/>
-      </w:rPr>
-      <w:fldChar w:fldCharType="separate"/>
-    </w:r>
-    <w:r>
-      <w:rPr>
-        <w:rFonts w:ascii="Arial" w:hAnsi="Arial" w:cs="Arial"/>
-        <w:bCs/>
-        <w:sz w:val="18"/>
-        <w:szCs w:val="18"/>
-      </w:rPr>
-      <w:t>2</w:t>
-    </w:r>
-    <w:r>
-      <w:rPr>
-        <w:rFonts w:ascii="Arial" w:hAnsi="Arial" w:cs="Arial"/>
-        <w:bCs/>
-        <w:sz w:val="18"/>
-        <w:szCs w:val="18"/>
-      </w:rPr>
-      <w:fldChar w:fldCharType="end"/>
-    </w:r>
-    <w:r>
-      <w:rPr>
-        <w:rFonts w:ascii="Arial" w:hAnsi="Arial" w:cs="Arial"/>
-        <w:sz w:val="18"/>
-        <w:szCs w:val="18"/>
-      </w:rPr>
-      <w:t xml:space="preserve"> of </w:t>
-    </w:r>
-    <w:r>
-      <w:rPr>
-        <w:rFonts w:ascii="Arial" w:hAnsi="Arial" w:cs="Arial"/>
-        <w:bCs/>
-        <w:sz w:val="18"/>
-        <w:szCs w:val="18"/>
-      </w:rPr>
-      <w:fldChar w:fldCharType="begin"/>
-    </w:r>
-    <w:r>
-      <w:rPr>
-        <w:rFonts w:ascii="Arial" w:hAnsi="Arial" w:cs="Arial"/>
-        <w:bCs/>
-        <w:sz w:val="18"/>
-        <w:szCs w:val="18"/>
-      </w:rPr>
-      <w:instrText xml:space="preserve"> NUMPAGES \* ARABIC </w:instrText>
-    </w:r>
-    <w:r>
-      <w:rPr>
-        <w:rFonts w:ascii="Arial" w:hAnsi="Arial" w:cs="Arial"/>
-        <w:bCs/>
-        <w:sz w:val="18"/>
-        <w:szCs w:val="18"/>
-      </w:rPr>
-      <w:fldChar w:fldCharType="separate"/>
-    </w:r>
-    <w:r>
-      <w:rPr>
-        <w:rFonts w:ascii="Arial" w:hAnsi="Arial" w:cs="Arial"/>
-        <w:bCs/>
-        <w:sz w:val="18"/>
-        <w:szCs w:val="18"/>
-      </w:rPr>
-      <w:t>2</w:t>
-    </w:r>
-    <w:r>
-      <w:rPr>
-        <w:rFonts w:ascii="Arial" w:hAnsi="Arial" w:cs="Arial"/>
-        <w:bCs/>
-        <w:sz w:val="18"/>
-        <w:szCs w:val="18"/>
-      </w:rPr>
-      <w:fldChar w:fldCharType="end"/>
     </w:r>
     <w:r>
       <w:rPr>
@@ -3418,6 +3128,17 @@
     <w:name w:val="WW8Num26"/>
     <w:qFormat/>
   </w:style>
+  <w:style w:type="character" w:styleId="UnresolvedMention">
+    <w:name w:val="Unresolved Mention"/>
+    <w:uiPriority w:val="99"/>
+    <w:semiHidden/>
+    <w:unhideWhenUsed/>
+    <w:rsid w:val="00650B05"/>
+    <w:rPr>
+      <w:color w:val="605E5C"/>
+      <w:shd w:val="clear" w:color="auto" w:fill="E1DFDD"/>
+    </w:rPr>
+  </w:style>
 </w:styles>
 </file>
 

</xml_diff>